<commit_message>
Add journal_style and journal_tables modules for reporting
- Implemented journal_style.py to define styles for document formatting, including page, font, paragraph, heading, table, figure, caption, header, footer, and reference styles.
- Added utility functions for setting font, paragraph formatting, section configuration, and table management.
- Created journal_tables.py to manage the generation of various tables related to monetary policy reports, including data formatting and writing to CSV and Excel files.
- Introduced data classes and helper functions for building structured tables from processed data.
</commit_message>
<xml_diff>
--- a/references/journal_format/课程论文封面.docx
+++ b/references/journal_format/课程论文封面.docx
@@ -1181,7 +1181,15 @@
                 <w:sz w:val="32"/>
                 <w:szCs w:val="32"/>
               </w:rPr>
-              <w:t>20</w:t>
+              <w:t>2</w:t>
+            </w:r>
+            <w:r>
+              <w:rPr>
+                <w:rFonts w:ascii="黑体" w:eastAsia="黑体" w:hAnsi="黑体" w:hint="eastAsia"/>
+                <w:sz w:val="32"/>
+                <w:szCs w:val="32"/>
+              </w:rPr>
+              <w:t>4</w:t>
             </w:r>
             <w:r>
               <w:rPr>
@@ -1199,7 +1207,7 @@
       <w:pPr>
         <w:spacing w:line="400" w:lineRule="exact"/>
         <w:rPr>
-          <w:rFonts w:ascii="黑体" w:eastAsia="黑体" w:hAnsi="黑体" w:cs="黑体" w:hint="eastAsia"/>
+          <w:rFonts w:ascii="黑体" w:eastAsia="黑体" w:hAnsi="黑体" w:cs="黑体"/>
           <w:sz w:val="24"/>
         </w:rPr>
       </w:pPr>
@@ -1668,6 +1676,7 @@
   <w:style w:type="character" w:default="1" w:styleId="a0">
     <w:name w:val="Default Paragraph Font"/>
     <w:uiPriority w:val="1"/>
+    <w:semiHidden/>
     <w:unhideWhenUsed/>
   </w:style>
   <w:style w:type="table" w:default="1" w:styleId="a1">

</xml_diff>